<commit_message>
feat: aprimora busca, propostas e previa instantanea
</commit_message>
<xml_diff>
--- a/ocr_edital_web/templates/modelo_proposta_goldflex.docx
+++ b/ocr_edital_web/templates/modelo_proposta_goldflex.docx
@@ -14,6 +14,13 @@
         </w:rPr>
         <w:t xml:space="preserve">                                                                        </w:t>
       </w:r>
+      <w:proofErr w:type="gramStart"/>
+      <w:r>
+        <w:rPr>
+          <w:rFonts w:ascii="Aptos" w:eastAsia="Aptos" w:hAnsi="Aptos" w:cs="Aptos"/>
+        </w:rPr>
+        <w:t>{</w:t>
+      </w:r>
       <w:r>
         <w:rPr>
           <w:rFonts w:ascii="Aptos" w:eastAsia="Aptos" w:hAnsi="Aptos" w:cs="Aptos"/>
@@ -26,7 +33,16 @@
           <w:b/>
           <w:bCs/>
         </w:rPr>
-        <w:t>PROPOSTA FINAL</w:t>
+        <w:t>PROPOSTA</w:t>
+      </w:r>
+      <w:proofErr w:type="gramEnd"/>
+      <w:r>
+        <w:rPr>
+          <w:rFonts w:ascii="Aptos" w:eastAsia="Aptos" w:hAnsi="Aptos" w:cs="Aptos"/>
+          <w:b/>
+          <w:bCs/>
+        </w:rPr>
+        <w:t xml:space="preserve"> FINAL</w:t>
       </w:r>
       <w:r>
         <w:rPr>
@@ -35,12 +51,24 @@
         <w:t xml:space="preserve"> </w:t>
       </w:r>
       <w:r>
+        <w:rPr>
+          <w:rFonts w:ascii="Aptos" w:eastAsia="Aptos" w:hAnsi="Aptos" w:cs="Aptos"/>
+        </w:rPr>
+        <w:t>}</w:t>
+      </w:r>
+      <w:r>
         <w:br/>
       </w:r>
     </w:p>
     <w:p>
       <w:r>
         <w:br/>
+      </w:r>
+      <w:r>
+        <w:rPr>
+          <w:rFonts w:ascii="Aptos" w:eastAsia="Aptos" w:hAnsi="Aptos" w:cs="Aptos"/>
+        </w:rPr>
+        <w:t>{</w:t>
       </w:r>
       <w:r>
         <w:rPr>
@@ -61,78 +89,11 @@
         <w:t>Razão Social: GOLDFLEX INDUSTRIA E COMERCIO DE MOVEIS E EQUIPAMENTOS LTDA CNPJ: 33.661.439/0001-14 INSCRIÇÃO ESTADUAL: 456.195.895118 Endereço: R: Eça de Queiroz, 199 Loteamento Linda Chaib Mogi Mirim - SP Telefone: (19) 97126-6023 E-mail: licitagoldflex@gmail.com Dados Bancários: Banco do Brasil Ag 578-9 C/C 56817-1.</w:t>
       </w:r>
       <w:r>
-        <w:br/>
-      </w:r>
-      <w:r>
-        <w:br/>
-      </w:r>
-      <w:r>
         <w:rPr>
           <w:rFonts w:ascii="Aptos" w:eastAsia="Aptos" w:hAnsi="Aptos" w:cs="Aptos"/>
         </w:rPr>
-        <w:t>Representante: Brendon Matheus Batista, CPF: 432.079.848-19.</w:t>
-      </w:r>
-      <w:r>
-        <w:br/>
-      </w:r>
-      <w:r>
-        <w:rPr>
-          <w:rFonts w:ascii="Aptos" w:eastAsia="Aptos" w:hAnsi="Aptos" w:cs="Aptos"/>
-        </w:rPr>
-        <w:t>Cargo: Sócio Majoritário / Engenheiro de produção.</w:t>
-      </w:r>
-      <w:r>
-        <w:br/>
-      </w:r>
-      <w:r>
-        <w:rPr>
-          <w:rFonts w:ascii="Aptos" w:eastAsia="Aptos" w:hAnsi="Aptos" w:cs="Aptos"/>
-        </w:rPr>
-        <w:t>Brasileiro, Naturalidade: Mogi Mirim - SP.</w:t>
-      </w:r>
-      <w:r>
-        <w:br/>
-      </w:r>
-      <w:r>
-        <w:rPr>
-          <w:rFonts w:ascii="Aptos" w:eastAsia="Aptos" w:hAnsi="Aptos" w:cs="Aptos"/>
-        </w:rPr>
-        <w:t xml:space="preserve">RG: 50.630.673-2 Órgão Emissor : SSP - SP. </w:t>
-      </w:r>
-      <w:r>
-        <w:br/>
-      </w:r>
-      <w:r>
-        <w:rPr>
-          <w:rFonts w:ascii="Aptos" w:eastAsia="Aptos" w:hAnsi="Aptos" w:cs="Aptos"/>
-        </w:rPr>
-        <w:t>Endereço: R: Eça de Queiroz, 199 Loteamento Linda Chaib Mogi Mirim - SP.</w:t>
-      </w:r>
-      <w:r>
-        <w:br/>
-      </w:r>
-      <w:r>
-        <w:rPr>
-          <w:rFonts w:ascii="Aptos" w:eastAsia="Aptos" w:hAnsi="Aptos" w:cs="Aptos"/>
-        </w:rPr>
-        <w:t>CEP: 13.802-450.</w:t>
-      </w:r>
-      <w:r>
-        <w:br/>
-      </w:r>
-      <w:r>
-        <w:rPr>
-          <w:rFonts w:ascii="Aptos" w:eastAsia="Aptos" w:hAnsi="Aptos" w:cs="Aptos"/>
-        </w:rPr>
-        <w:t>Telefone: (19) 97126-6023</w:t>
-      </w:r>
-    </w:p>
-    <w:p/>
-    <w:p/>
-    <w:p>
-      <w:pPr>
-        <w:spacing w:after="0"/>
-      </w:pPr>
+        <w:t>}</w:t>
+      </w:r>
     </w:p>
     <w:sectPr>
       <w:headerReference w:type="default" r:id="rId6"/>
@@ -541,6 +502,7 @@
     <w:lsdException w:name="HTML Sample" w:semiHidden="1" w:unhideWhenUsed="1"/>
     <w:lsdException w:name="HTML Typewriter" w:semiHidden="1" w:unhideWhenUsed="1"/>
     <w:lsdException w:name="HTML Variable" w:semiHidden="1" w:unhideWhenUsed="1"/>
+    <w:lsdException w:name="Normal Table" w:semiHidden="1" w:unhideWhenUsed="1"/>
     <w:lsdException w:name="annotation subject" w:semiHidden="1" w:unhideWhenUsed="1"/>
     <w:lsdException w:name="No List" w:semiHidden="1" w:unhideWhenUsed="1"/>
     <w:lsdException w:name="Outline List 1" w:semiHidden="1" w:unhideWhenUsed="1"/>
@@ -583,8 +545,11 @@
     <w:lsdException w:name="Table Contemporary" w:semiHidden="1" w:unhideWhenUsed="1"/>
     <w:lsdException w:name="Table Elegant" w:semiHidden="1" w:unhideWhenUsed="1"/>
     <w:lsdException w:name="Table Professional" w:semiHidden="1" w:unhideWhenUsed="1"/>
+    <w:lsdException w:name="Table Subtle 1" w:semiHidden="1" w:unhideWhenUsed="1"/>
     <w:lsdException w:name="Table Subtle 2" w:semiHidden="1" w:unhideWhenUsed="1"/>
     <w:lsdException w:name="Table Web 1" w:semiHidden="1" w:unhideWhenUsed="1"/>
+    <w:lsdException w:name="Table Web 2" w:semiHidden="1" w:unhideWhenUsed="1"/>
+    <w:lsdException w:name="Table Web 3" w:semiHidden="1" w:unhideWhenUsed="1"/>
     <w:lsdException w:name="Balloon Text" w:semiHidden="1" w:unhideWhenUsed="1"/>
     <w:lsdException w:name="Table Grid" w:uiPriority="39"/>
     <w:lsdException w:name="Table Theme" w:semiHidden="1" w:unhideWhenUsed="1"/>

</xml_diff>

<commit_message>
feat: aprimora fluxos dos blocos 1 2 4 e 7
</commit_message>
<xml_diff>
--- a/ocr_edital_web/templates/modelo_proposta_goldflex.docx
+++ b/ocr_edital_web/templates/modelo_proposta_goldflex.docx
@@ -93,6 +93,19 @@
           <w:rFonts w:ascii="Aptos" w:eastAsia="Aptos" w:hAnsi="Aptos" w:cs="Aptos"/>
         </w:rPr>
         <w:t>}</w:t>
+      </w:r>
+      <w:r>
+        <w:rPr>
+          <w:rFonts w:ascii="Aptos" w:eastAsia="Aptos" w:hAnsi="Aptos" w:cs="Aptos"/>
+        </w:rPr>
+        <w:br/>
+      </w:r>
+      <w:r>
+        <w:rPr>
+          <w:rFonts w:ascii="Aptos" w:eastAsia="Aptos" w:hAnsi="Aptos" w:cs="Aptos"/>
+        </w:rPr>
+        <w:br/>
+        <w:t>{teste para um mini-box}</w:t>
       </w:r>
     </w:p>
     <w:sectPr>

</xml_diff>